<commit_message>
Fix column lineage user guide: add missing build_formula_index (A7), expand Sub-pass C with C4 and C5
</commit_message>
<xml_diff>
--- a/column-lineage/ThoughtSpot_Column_Lineage_User_Guide.docx
+++ b/column-lineage/ThoughtSpot_Column_Lineage_User_Guide.docx
@@ -1821,7 +1821,7 @@
                 <w:color w:val="C00000"/>
                 <w:sz w:val="18"/>
               </w:rPr>
-              <w:t>extract_model_columns()</w:t>
+              <w:t>build_formula_index()</w:t>
             </w:r>
           </w:p>
         </w:tc>
@@ -1833,9 +1833,57 @@
           <w:p>
             <w:r>
               <w:rPr>
+                <w:rFonts w:ascii="Courier New" w:hAnsi="Courier New"/>
+                <w:color w:val="C00000"/>
+                <w:sz w:val="18"/>
+              </w:rPr>
+              <w:t>Called once per model inside extract_model_columns(). Builds a {formula_name → expression} index from the model TML formulas list. Used to enrich formula columns with their raw expression in the output.</w:t>
+            </w:r>
+          </w:p>
+        </w:tc>
+      </w:tr>
+      <w:tr>
+        <w:tc>
+          <w:tcPr>
+            <w:tcW w:type="dxa" w:w="432"/>
+            <w:shd w:val="clear" w:color="auto" w:fill="FFFFFF"/>
+          </w:tcPr>
+          <w:p>
+            <w:r>
+              <w:rPr>
                 <w:sz w:val="20"/>
               </w:rPr>
-              <w:t>Iterates all model TMLs and emits one row per column with full enrichment: column_guid, formula expression, source table, db/schema/connection details.</w:t>
+              <w:t>A8</w:t>
+            </w:r>
+          </w:p>
+        </w:tc>
+        <w:tc>
+          <w:tcPr>
+            <w:tcW w:type="dxa" w:w="3600"/>
+            <w:shd w:val="clear" w:color="auto" w:fill="FFFFFF"/>
+          </w:tcPr>
+          <w:p>
+            <w:r>
+              <w:rPr>
+                <w:rFonts w:ascii="Courier New" w:hAnsi="Courier New"/>
+                <w:color w:val="C00000"/>
+                <w:sz w:val="18"/>
+              </w:rPr>
+              <w:t>extract_model_columns()  →  _extract_model_columns_one()</w:t>
+            </w:r>
+          </w:p>
+        </w:tc>
+        <w:tc>
+          <w:tcPr>
+            <w:tcW w:type="dxa" w:w="5760"/>
+            <w:shd w:val="clear" w:color="auto" w:fill="FFFFFF"/>
+          </w:tcPr>
+          <w:p>
+            <w:r>
+              <w:rPr>
+                <w:sz w:val="20"/>
+              </w:rPr>
+              <w:t>Iterates all model TMLs and emits one row per column with full enrichment: column_guid, formula expression (from A7 index), source table name and GUID (from A5 lookup), db/schema/connection details. No search_query parsing — model columns are read directly from the TML column definitions.</w:t>
             </w:r>
           </w:p>
         </w:tc>
@@ -2265,7 +2313,7 @@
               <w:rPr>
                 <w:sz w:val="20"/>
               </w:rPr>
-              <w:t>Fetches all standalone ANSWER objects for the org.</w:t>
+              <w:t>Fetches all standalone ANSWER objects for the org, paginated. System User answers excluded.</w:t>
             </w:r>
           </w:p>
         </w:tc>
@@ -2311,7 +2359,7 @@
               <w:rPr>
                 <w:sz w:val="20"/>
               </w:rPr>
-              <w:t>Exports the TML bundle for each answer.</w:t>
+              <w:t>Exports the full TML bundle for each answer (export_associated=True) — includes the answer TML plus the TML of every model, table, or view the answer references.</w:t>
             </w:r>
           </w:p>
         </w:tc>
@@ -2359,7 +2407,101 @@
                 <w:color w:val="C00000"/>
                 <w:sz w:val="18"/>
               </w:rPr>
-              <w:t>Same logic as extract_liveboard_columns() but for answers. Per-source formula index, search_query primary path, display-name fallback.</w:t>
+              <w:t>Parses the bundle: builds a per-source formula index (one dict per model GUID, never merged across models), resolves the answer's data source, then extracts columns via parse_search_query() if search_query is present, or resolve_and_classify() as fallback. Identical pipeline to extract_liveboard_columns().</w:t>
+            </w:r>
+          </w:p>
+        </w:tc>
+      </w:tr>
+      <w:tr>
+        <w:tc>
+          <w:tcPr>
+            <w:tcW w:type="dxa" w:w="432"/>
+            <w:shd w:val="clear" w:color="auto" w:fill="FFFFFF"/>
+          </w:tcPr>
+          <w:p>
+            <w:r>
+              <w:rPr>
+                <w:sz w:val="20"/>
+              </w:rPr>
+              <w:t>C4</w:t>
+            </w:r>
+          </w:p>
+        </w:tc>
+        <w:tc>
+          <w:tcPr>
+            <w:tcW w:type="dxa" w:w="3600"/>
+            <w:shd w:val="clear" w:color="auto" w:fill="FFFFFF"/>
+          </w:tcPr>
+          <w:p>
+            <w:r>
+              <w:rPr>
+                <w:rFonts w:ascii="Courier New" w:hAnsi="Courier New"/>
+                <w:color w:val="C00000"/>
+                <w:sz w:val="18"/>
+              </w:rPr>
+              <w:t>_classify_sq_token()</w:t>
+            </w:r>
+          </w:p>
+        </w:tc>
+        <w:tc>
+          <w:tcPr>
+            <w:tcW w:type="dxa" w:w="5760"/>
+            <w:shd w:val="clear" w:color="auto" w:fill="FFFFFF"/>
+          </w:tcPr>
+          <w:p>
+            <w:r>
+              <w:rPr>
+                <w:sz w:val="20"/>
+              </w:rPr>
+              <w:t>Classifies each search_query token as: answer-level formula, model-level formula, cohort, or physical column. Same function as B4 — shared between liveboard and answer passes.</w:t>
+            </w:r>
+          </w:p>
+        </w:tc>
+      </w:tr>
+      <w:tr>
+        <w:tc>
+          <w:tcPr>
+            <w:tcW w:type="dxa" w:w="432"/>
+            <w:shd w:val="clear" w:color="auto" w:fill="DEEAF1"/>
+          </w:tcPr>
+          <w:p>
+            <w:r>
+              <w:rPr>
+                <w:sz w:val="20"/>
+              </w:rPr>
+              <w:t>C5</w:t>
+            </w:r>
+          </w:p>
+        </w:tc>
+        <w:tc>
+          <w:tcPr>
+            <w:tcW w:type="dxa" w:w="3600"/>
+            <w:shd w:val="clear" w:color="auto" w:fill="DEEAF1"/>
+          </w:tcPr>
+          <w:p>
+            <w:r>
+              <w:rPr>
+                <w:rFonts w:ascii="Courier New" w:hAnsi="Courier New"/>
+                <w:color w:val="C00000"/>
+                <w:sz w:val="18"/>
+              </w:rPr>
+              <w:t>resolve_and_classify()</w:t>
+            </w:r>
+          </w:p>
+        </w:tc>
+        <w:tc>
+          <w:tcPr>
+            <w:tcW w:type="dxa" w:w="5760"/>
+            <w:shd w:val="clear" w:color="auto" w:fill="DEEAF1"/>
+          </w:tcPr>
+          <w:p>
+            <w:r>
+              <w:rPr>
+                <w:rFonts w:ascii="Courier New" w:hAnsi="Courier New"/>
+                <w:color w:val="C00000"/>
+                <w:sz w:val="18"/>
+              </w:rPr>
+              <w:t>Fallback classifier used when search_query is absent: strips ThoughtSpot display prefixes (Total, Average, Month(), etc.) using _candidates(), then checks the per-source formula index and physical column lookup. Same function as B5.</w:t>
             </w:r>
           </w:p>
         </w:tc>

</xml_diff>